<commit_message>
Add top five manual rate authors chart
</commit_message>
<xml_diff>
--- a/Project Overview and Summary.docx
+++ b/Project Overview and Summary.docx
@@ -4,211 +4,15 @@
   <w:body>
     <w:p>
       <w:r>
-        <w:t>MC Notes Data (data pulled from the files):</w:t>
-      </w:r>
-    </w:p>
-    <w:p>
-      <w:pPr>
-        <w:pStyle w:val="ListParagraph"/>
-        <w:numPr>
-          <w:ilvl w:val="0"/>
-          <w:numId w:val="1"/>
-        </w:numPr>
-      </w:pPr>
-      <w:r>
-        <w:t>Operation Number</w:t>
-      </w:r>
-    </w:p>
-    <w:p>
-      <w:pPr>
-        <w:pStyle w:val="ListParagraph"/>
-        <w:numPr>
-          <w:ilvl w:val="0"/>
-          <w:numId w:val="1"/>
-        </w:numPr>
-      </w:pPr>
-      <w:r>
-        <w:t xml:space="preserve">File Name </w:t>
-      </w:r>
-    </w:p>
-    <w:p>
-      <w:pPr>
-        <w:pStyle w:val="ListParagraph"/>
-        <w:numPr>
-          <w:ilvl w:val="0"/>
-          <w:numId w:val="1"/>
-        </w:numPr>
-      </w:pPr>
-      <w:r>
-        <w:t>Validation Date and Author</w:t>
-      </w:r>
-    </w:p>
-    <w:p>
-      <w:pPr>
-        <w:pStyle w:val="ListParagraph"/>
-        <w:numPr>
-          <w:ilvl w:val="1"/>
-          <w:numId w:val="1"/>
-        </w:numPr>
-      </w:pPr>
-      <w:r>
-        <w:t>More important in OTHER types</w:t>
-      </w:r>
-    </w:p>
-    <w:p>
-      <w:pPr>
-        <w:pStyle w:val="ListParagraph"/>
-        <w:numPr>
-          <w:ilvl w:val="0"/>
-          <w:numId w:val="1"/>
-        </w:numPr>
-      </w:pPr>
-      <w:r>
-        <w:t>Word Counts</w:t>
-      </w:r>
-    </w:p>
-    <w:p/>
-    <w:p>
-      <w:r>
-        <w:t>BO Data:</w:t>
-      </w:r>
-    </w:p>
-    <w:p>
-      <w:pPr>
-        <w:pStyle w:val="ListParagraph"/>
-        <w:numPr>
-          <w:ilvl w:val="0"/>
-          <w:numId w:val="2"/>
-        </w:numPr>
-      </w:pPr>
-      <w:r>
-        <w:t>Operation Number</w:t>
-      </w:r>
-    </w:p>
-    <w:p>
-      <w:pPr>
-        <w:pStyle w:val="ListParagraph"/>
-        <w:numPr>
-          <w:ilvl w:val="0"/>
-          <w:numId w:val="2"/>
-        </w:numPr>
-      </w:pPr>
-      <w:r>
-        <w:t xml:space="preserve">Project Details </w:t>
-      </w:r>
-    </w:p>
-    <w:p>
-      <w:pPr>
-        <w:pStyle w:val="ListParagraph"/>
-        <w:numPr>
-          <w:ilvl w:val="0"/>
-          <w:numId w:val="2"/>
-        </w:numPr>
-      </w:pPr>
-      <w:r>
-        <w:t>Author</w:t>
-      </w:r>
-    </w:p>
-    <w:p>
-      <w:pPr>
-        <w:pStyle w:val="ListParagraph"/>
-        <w:numPr>
-          <w:ilvl w:val="0"/>
-          <w:numId w:val="2"/>
-        </w:numPr>
-      </w:pPr>
-      <w:r>
-        <w:t>Opinion Authors</w:t>
-      </w:r>
-    </w:p>
-    <w:p>
-      <w:pPr>
-        <w:pStyle w:val="ListParagraph"/>
-      </w:pPr>
-    </w:p>
-    <w:p>
-      <w:r>
-        <w:t xml:space="preserve">Master File (Merged Data on Operation Number) </w:t>
-      </w:r>
-    </w:p>
-    <w:p/>
-    <w:p>
-      <w:r>
-        <w:t>Auditing Data (Missing files)</w:t>
-      </w:r>
-    </w:p>
-    <w:p>
-      <w:pPr>
-        <w:pStyle w:val="ListParagraph"/>
-        <w:numPr>
-          <w:ilvl w:val="0"/>
-          <w:numId w:val="4"/>
-        </w:numPr>
-      </w:pPr>
-      <w:r>
-        <w:t xml:space="preserve">For GNG and AFS the MC Notes file should contain all the non-confidential operations found in a given period. </w:t>
-      </w:r>
-    </w:p>
-    <w:p>
-      <w:pPr>
-        <w:pStyle w:val="ListParagraph"/>
-        <w:numPr>
-          <w:ilvl w:val="0"/>
-          <w:numId w:val="4"/>
-        </w:numPr>
-      </w:pPr>
-      <w:r>
-        <w:t xml:space="preserve">For OTHER…. </w:t>
-      </w:r>
-    </w:p>
-    <w:p/>
-    <w:p>
-      <w:pPr>
-        <w:pStyle w:val="ListParagraph"/>
-      </w:pPr>
-      <w:r>
-        <w:t>5,600 - 5,629 = -29 records</w:t>
-      </w:r>
-      <w:r>
-        <w:t xml:space="preserve"> without duplicates </w:t>
-      </w:r>
-    </w:p>
-    <w:p/>
-    <w:p>
-      <w:r>
-        <w:t>Auditing Data (the robot</w:t>
-      </w:r>
-      <w:r>
-        <w:t xml:space="preserve"> v visual) </w:t>
-      </w:r>
-    </w:p>
-    <w:p>
-      <w:r>
-        <w:t xml:space="preserve">There is an audit file prepared to reifenroce the data quality of the data. </w:t>
-      </w:r>
-    </w:p>
-    <w:p/>
-    <w:p>
-      <w:r>
-        <w:t xml:space="preserve">Main issues: mismatch between analyzed files and overall files; need to improve auditing and develop an automated system; </w:t>
-      </w:r>
-    </w:p>
-    <w:p/>
-    <w:p>
-      <w:r>
         <w:br w:type="page"/>
       </w:r>
-    </w:p>
-    <w:p>
-      <w:pPr>
-        <w:jc w:val="center"/>
-      </w:pPr>
       <w:r>
         <w:rPr>
           <w:b/>
           <w:color w:val="1F4E79"/>
           <w:sz w:val="44"/>
         </w:rPr>
+        <w:lastRenderedPageBreak/>
         <w:t>Project Overview and Summary</w:t>
       </w:r>
     </w:p>
@@ -220,7 +24,6 @@
         <w:rPr>
           <w:i/>
           <w:color w:val="595959"/>
-          <w:sz w:val="20"/>
         </w:rPr>
         <w:t>Expanded operating model for the MC Notes extraction, validation, master table, and Power BI reporting workflow</w:t>
       </w:r>
@@ -235,7 +38,27 @@
     </w:p>
     <w:p>
       <w:r>
-        <w:t>The MC Notes project creates a repeatable pipeline for extracting, validating, merging, and analyzing Management Committee note data. It covers GNG, AFS, and OTHER note families, with PIN retained in the master database where useful for full-database comparison. The steady-state objective is to refresh the files monthly, keep the master dataset auditable, and use Power BI as the reporting layer.</w:t>
+        <w:t xml:space="preserve">The MC Notes project creates a repeatable pipeline for extracting, validating, merging, and </w:t>
+      </w:r>
+      <w:proofErr w:type="spellStart"/>
+      <w:r>
+        <w:t>analyzing</w:t>
+      </w:r>
+      <w:proofErr w:type="spellEnd"/>
+      <w:r>
+        <w:t xml:space="preserve"> Management Committee note data. It covers GNG, AFS, and OTHER note families, with PIN retained in the database </w:t>
+      </w:r>
+      <w:r>
+        <w:t xml:space="preserve">to show transition. </w:t>
+      </w:r>
+      <w:r>
+        <w:t xml:space="preserve">The steady-state objective is to refresh the files monthly, keep the master dataset </w:t>
+      </w:r>
+      <w:r>
+        <w:t xml:space="preserve">quality internally </w:t>
+      </w:r>
+      <w:r>
+        <w:t>auditable, and use Power BI as the reporting layer.</w:t>
       </w:r>
     </w:p>
     <w:p>
@@ -248,19 +71,22 @@
     </w:p>
     <w:tbl>
       <w:tblPr>
-        <w:tblW w:type="auto" w:w="0"/>
+        <w:tblW w:w="0" w:type="auto"/>
         <w:jc w:val="center"/>
-        <w:tblLook w:firstColumn="1" w:firstRow="1" w:lastColumn="0" w:lastRow="0" w:noHBand="0" w:noVBand="1" w:val="04A0"/>
+        <w:tblLook w:val="04A0" w:firstRow="1" w:lastRow="0" w:firstColumn="1" w:lastColumn="0" w:noHBand="0" w:noVBand="1"/>
       </w:tblPr>
       <w:tblGrid>
-        <w:gridCol w:w="3201"/>
-        <w:gridCol w:w="3201"/>
-        <w:gridCol w:w="3201"/>
+        <w:gridCol w:w="3091"/>
+        <w:gridCol w:w="3089"/>
+        <w:gridCol w:w="3422"/>
       </w:tblGrid>
       <w:tr>
+        <w:trPr>
+          <w:jc w:val="center"/>
+        </w:trPr>
         <w:tc>
           <w:tcPr>
-            <w:tcW w:type="dxa" w:w="3201"/>
+            <w:tcW w:w="3091" w:type="dxa"/>
             <w:vAlign w:val="center"/>
           </w:tcPr>
           <w:p>
@@ -274,7 +100,7 @@
         </w:tc>
         <w:tc>
           <w:tcPr>
-            <w:tcW w:type="dxa" w:w="3201"/>
+            <w:tcW w:w="3089" w:type="dxa"/>
             <w:vAlign w:val="center"/>
           </w:tcPr>
           <w:p>
@@ -288,7 +114,7 @@
         </w:tc>
         <w:tc>
           <w:tcPr>
-            <w:tcW w:type="dxa" w:w="3201"/>
+            <w:tcW w:w="3422" w:type="dxa"/>
             <w:vAlign w:val="center"/>
           </w:tcPr>
           <w:p>
@@ -302,9 +128,12 @@
         </w:tc>
       </w:tr>
       <w:tr>
+        <w:trPr>
+          <w:jc w:val="center"/>
+        </w:trPr>
         <w:tc>
           <w:tcPr>
-            <w:tcW w:type="dxa" w:w="3201"/>
+            <w:tcW w:w="3091" w:type="dxa"/>
           </w:tcPr>
           <w:p>
             <w:r>
@@ -314,7 +143,7 @@
         </w:tc>
         <w:tc>
           <w:tcPr>
-            <w:tcW w:type="dxa" w:w="3201"/>
+            <w:tcW w:w="3089" w:type="dxa"/>
           </w:tcPr>
           <w:p>
             <w:r>
@@ -324,19 +153,27 @@
         </w:tc>
         <w:tc>
           <w:tcPr>
-            <w:tcW w:type="dxa" w:w="3201"/>
+            <w:tcW w:w="3422" w:type="dxa"/>
           </w:tcPr>
           <w:p>
+            <w:proofErr w:type="spellStart"/>
             <w:r>
-              <w:t>GNG_Package/gng_extractor.py; analysis/run_analysis.py GNG</w:t>
+              <w:t>GNG_Package</w:t>
+            </w:r>
+            <w:proofErr w:type="spellEnd"/>
+            <w:r>
+              <w:t>/gng_extractor.py; analysis/run_analysis.py GNG</w:t>
             </w:r>
           </w:p>
         </w:tc>
       </w:tr>
       <w:tr>
+        <w:trPr>
+          <w:jc w:val="center"/>
+        </w:trPr>
         <w:tc>
           <w:tcPr>
-            <w:tcW w:type="dxa" w:w="3201"/>
+            <w:tcW w:w="3091" w:type="dxa"/>
           </w:tcPr>
           <w:p>
             <w:r>
@@ -346,7 +183,7 @@
         </w:tc>
         <w:tc>
           <w:tcPr>
-            <w:tcW w:type="dxa" w:w="3201"/>
+            <w:tcW w:w="3089" w:type="dxa"/>
           </w:tcPr>
           <w:p>
             <w:r>
@@ -356,29 +193,42 @@
         </w:tc>
         <w:tc>
           <w:tcPr>
-            <w:tcW w:type="dxa" w:w="3201"/>
+            <w:tcW w:w="3422" w:type="dxa"/>
           </w:tcPr>
           <w:p>
+            <w:proofErr w:type="spellStart"/>
             <w:r>
-              <w:t>AFS_Package/afs_extractor.py; analysis/run_analysis.py AFS</w:t>
+              <w:t>AFS_Package</w:t>
+            </w:r>
+            <w:proofErr w:type="spellEnd"/>
+            <w:r>
+              <w:t>/afs_extractor.py; analysis/run_analysis.py AFS</w:t>
             </w:r>
           </w:p>
         </w:tc>
       </w:tr>
       <w:tr>
+        <w:trPr>
+          <w:jc w:val="center"/>
+        </w:trPr>
         <w:tc>
           <w:tcPr>
-            <w:tcW w:type="dxa" w:w="3201"/>
+            <w:tcW w:w="3091" w:type="dxa"/>
           </w:tcPr>
           <w:p>
+            <w:proofErr w:type="gramStart"/>
             <w:r>
-              <w:t>OTHER package</w:t>
+              <w:t>OTHER</w:t>
+            </w:r>
+            <w:proofErr w:type="gramEnd"/>
+            <w:r>
+              <w:t xml:space="preserve"> package</w:t>
             </w:r>
           </w:p>
         </w:tc>
         <w:tc>
           <w:tcPr>
-            <w:tcW w:type="dxa" w:w="3201"/>
+            <w:tcW w:w="3089" w:type="dxa"/>
           </w:tcPr>
           <w:p>
             <w:r>
@@ -388,51 +238,35 @@
         </w:tc>
         <w:tc>
           <w:tcPr>
-            <w:tcW w:type="dxa" w:w="3201"/>
+            <w:tcW w:w="3422" w:type="dxa"/>
           </w:tcPr>
           <w:p>
+            <w:proofErr w:type="spellStart"/>
             <w:r>
-              <w:t>OTHER_Package/other_extractor.py; OTHER_Package/PREFIX_MERGE.xlsx</w:t>
+              <w:t>OTHER_Package</w:t>
+            </w:r>
+            <w:proofErr w:type="spellEnd"/>
+            <w:r>
+              <w:t xml:space="preserve">/other_extractor.py; </w:t>
+            </w:r>
+            <w:proofErr w:type="spellStart"/>
+            <w:r>
+              <w:t>OTHER_Package</w:t>
+            </w:r>
+            <w:proofErr w:type="spellEnd"/>
+            <w:r>
+              <w:t>/PREFIX_MERGE.xlsx</w:t>
             </w:r>
           </w:p>
         </w:tc>
       </w:tr>
       <w:tr>
+        <w:trPr>
+          <w:jc w:val="center"/>
+        </w:trPr>
         <w:tc>
           <w:tcPr>
-            <w:tcW w:type="dxa" w:w="3201"/>
-          </w:tcPr>
-          <w:p>
-            <w:r>
-              <w:t>Shared analysis</w:t>
-            </w:r>
-          </w:p>
-        </w:tc>
-        <w:tc>
-          <w:tcPr>
-            <w:tcW w:type="dxa" w:w="3201"/>
-          </w:tcPr>
-          <w:p>
-            <w:r>
-              <w:t>Runs registered accuracy checks and visible-PDF comparison workflows.</w:t>
-            </w:r>
-          </w:p>
-        </w:tc>
-        <w:tc>
-          <w:tcPr>
-            <w:tcW w:type="dxa" w:w="3201"/>
-          </w:tcPr>
-          <w:p>
-            <w:r>
-              <w:t>analysis/note_type_registry.json; analysis/*_visible_accuracy_analysis.py</w:t>
-            </w:r>
-          </w:p>
-        </w:tc>
-      </w:tr>
-      <w:tr>
-        <w:tc>
-          <w:tcPr>
-            <w:tcW w:type="dxa" w:w="3201"/>
+            <w:tcW w:w="3091" w:type="dxa"/>
           </w:tcPr>
           <w:p>
             <w:r>
@@ -442,7 +276,7 @@
         </w:tc>
         <w:tc>
           <w:tcPr>
-            <w:tcW w:type="dxa" w:w="3201"/>
+            <w:tcW w:w="3089" w:type="dxa"/>
           </w:tcPr>
           <w:p>
             <w:r>
@@ -452,19 +286,27 @@
         </w:tc>
         <w:tc>
           <w:tcPr>
-            <w:tcW w:type="dxa" w:w="3201"/>
+            <w:tcW w:w="3422" w:type="dxa"/>
           </w:tcPr>
           <w:p>
             <w:r>
-              <w:t>Data Analysis/Master Table.xlsx; Data Analysis/Master Table Power Query.m</w:t>
+              <w:t xml:space="preserve">Data Analysis/Master Table.xlsx; Data Analysis/Master Table Power </w:t>
             </w:r>
+            <w:proofErr w:type="spellStart"/>
+            <w:r>
+              <w:t>Query.m</w:t>
+            </w:r>
+            <w:proofErr w:type="spellEnd"/>
           </w:p>
         </w:tc>
       </w:tr>
       <w:tr>
+        <w:trPr>
+          <w:jc w:val="center"/>
+        </w:trPr>
         <w:tc>
           <w:tcPr>
-            <w:tcW w:type="dxa" w:w="3201"/>
+            <w:tcW w:w="3091" w:type="dxa"/>
           </w:tcPr>
           <w:p>
             <w:r>
@@ -474,7 +316,7 @@
         </w:tc>
         <w:tc>
           <w:tcPr>
-            <w:tcW w:type="dxa" w:w="3201"/>
+            <w:tcW w:w="3089" w:type="dxa"/>
           </w:tcPr>
           <w:p>
             <w:r>
@@ -484,7 +326,7 @@
         </w:tc>
         <w:tc>
           <w:tcPr>
-            <w:tcW w:type="dxa" w:w="3201"/>
+            <w:tcW w:w="3422" w:type="dxa"/>
           </w:tcPr>
           <w:p>
             <w:r>
@@ -499,46 +341,47 @@
         <w:pStyle w:val="Heading1"/>
       </w:pPr>
       <w:r>
-        <w:t>3. Data Scope And Current Baseline</w:t>
-      </w:r>
-    </w:p>
-    <w:p>
-      <w:r>
-        <w:rPr>
-          <w:sz w:val="20"/>
-        </w:rPr>
+        <w:t xml:space="preserve">3. Data Scope </w:t>
+      </w:r>
+      <w:proofErr w:type="gramStart"/>
+      <w:r>
+        <w:t>And</w:t>
+      </w:r>
+      <w:proofErr w:type="gramEnd"/>
+      <w:r>
+        <w:t xml:space="preserve"> Current Baseline</w:t>
+      </w:r>
+    </w:p>
+    <w:p>
+      <w:r>
         <w:t>- The latest analysis report shows 5,600 master records, with 5,346 automated records and 254 manual correction records.</w:t>
       </w:r>
     </w:p>
     <w:p>
       <w:r>
-        <w:rPr>
-          <w:sz w:val="20"/>
-        </w:rPr>
         <w:t>- Automated extraction represents 95.46 percent of records; manual correction represents 4.54 percent.</w:t>
       </w:r>
     </w:p>
     <w:p>
       <w:r>
-        <w:rPr>
-          <w:sz w:val="20"/>
-        </w:rPr>
         <w:t>- Validation-date coverage runs from 2019-03-06 to 2026-05-19 in the current reports, with 13 missing validation dates and no dates later than 2026-06-02.</w:t>
       </w:r>
     </w:p>
     <w:p>
       <w:r>
-        <w:rPr>
-          <w:sz w:val="20"/>
-        </w:rPr>
-        <w:t>- The master table includes operational fields such as Source, Template, Extraction, MC_Note_Type, File Name, Operation Number, Validation Date, Author, document/page counts, Text Before Opinions, service word-count columns, BO Validation Date, Financing Product Name, and BO team columns.</w:t>
-      </w:r>
-    </w:p>
-    <w:p>
-      <w:r>
-        <w:rPr>
-          <w:sz w:val="20"/>
-        </w:rPr>
+        <w:t xml:space="preserve">- The master table includes operational fields such as Source, Template, Extraction, </w:t>
+      </w:r>
+      <w:proofErr w:type="spellStart"/>
+      <w:r>
+        <w:t>MC_Note_Type</w:t>
+      </w:r>
+      <w:proofErr w:type="spellEnd"/>
+      <w:r>
+        <w:t>, File Name, Operation Number, Validation Date, Author, document/page counts, Text Before Opinions, service word-count columns, BO Validation Date, Financing Product Name, and BO team columns.</w:t>
+      </w:r>
+    </w:p>
+    <w:p>
+      <w:r>
         <w:t>- BO validation dates are present on 5,579 rows in the current report; 21 rows are missing BO validation dates.</w:t>
       </w:r>
     </w:p>
@@ -547,47 +390,41 @@
         <w:pStyle w:val="Heading1"/>
       </w:pPr>
       <w:r>
+        <w:lastRenderedPageBreak/>
         <w:t>4. Extraction And Validation Logic</w:t>
       </w:r>
     </w:p>
     <w:p>
       <w:r>
-        <w:rPr>
-          <w:sz w:val="20"/>
-        </w:rPr>
         <w:t>- Each note family has a dedicated extractor so template-specific parsing rules can remain isolated.</w:t>
       </w:r>
     </w:p>
     <w:p>
       <w:r>
-        <w:rPr>
-          <w:sz w:val="20"/>
-        </w:rPr>
         <w:t>- The shared analysis registry controls which note-type workflows are enabled and keeps GNG, AFS, and OTHER analysis runnable from one command pattern.</w:t>
       </w:r>
     </w:p>
     <w:p>
       <w:r>
-        <w:rPr>
-          <w:sz w:val="20"/>
-        </w:rPr>
         <w:t>- Robot-vs-visual audit files compare script output against independently rebuilt visible-PDF text, which is the main quality-control mechanism for word counts and metadata.</w:t>
       </w:r>
     </w:p>
     <w:p>
       <w:r>
-        <w:rPr>
-          <w:sz w:val="20"/>
-        </w:rPr>
         <w:t>- Known comparison differences usually arise from text-stream extraction versus visible-PDF tokenization, especially in Text Before Opinions.</w:t>
       </w:r>
     </w:p>
     <w:p>
       <w:r>
-        <w:rPr>
-          <w:sz w:val="20"/>
-        </w:rPr>
-        <w:t>- GNG service-word counts intentionally use the full service block, including prefix headings, status words such as Go, boilerplate intro lines, and service body text.</w:t>
+        <w:t xml:space="preserve">- GNG service-word counts intentionally use the </w:t>
+      </w:r>
+      <w:proofErr w:type="gramStart"/>
+      <w:r>
+        <w:t>full service</w:t>
+      </w:r>
+      <w:proofErr w:type="gramEnd"/>
+      <w:r>
+        <w:t xml:space="preserve"> block, including prefix headings, status words such as Go, boilerplate intro lines, and service body text.</w:t>
       </w:r>
     </w:p>
     <w:p>
@@ -595,43 +432,47 @@
         <w:pStyle w:val="Heading1"/>
       </w:pPr>
       <w:r>
-        <w:t>5. Master File And BO Data</w:t>
-      </w:r>
-    </w:p>
-    <w:p>
-      <w:r>
-        <w:t>The master file is the operational center of the project. It merges extracted MC note data with BO data on Operation Number, then exposes the fields needed for quality checks, monthly refreshes, and reporting. Power Query should remain the controlled transformation layer for the workbook, with exported CSVs or a Power BI connection used downstream.</w:t>
-      </w:r>
-    </w:p>
-    <w:p>
-      <w:r>
-        <w:rPr>
-          <w:sz w:val="20"/>
-        </w:rPr>
+        <w:t xml:space="preserve">5. Master File </w:t>
+      </w:r>
+      <w:proofErr w:type="gramStart"/>
+      <w:r>
+        <w:t>And</w:t>
+      </w:r>
+      <w:proofErr w:type="gramEnd"/>
+      <w:r>
+        <w:t xml:space="preserve"> BO Data</w:t>
+      </w:r>
+    </w:p>
+    <w:p>
+      <w:r>
+        <w:t xml:space="preserve">The master file is the operational </w:t>
+      </w:r>
+      <w:proofErr w:type="spellStart"/>
+      <w:r>
+        <w:t>center</w:t>
+      </w:r>
+      <w:proofErr w:type="spellEnd"/>
+      <w:r>
+        <w:t xml:space="preserve"> of the project. It merges extracted MC note data with BO data on Operation Number, then exposes the fields needed for quality checks, monthly refreshes, and reporting. Power Query should remain the controlled transformation layer for the workbook, with exported CSVs or a Power BI connection used downstream.</w:t>
+      </w:r>
+    </w:p>
+    <w:p>
+      <w:r>
         <w:t>- MC note data: operation number, file name, validation date, author, page counts, text-before-opinion word counts, and service opinion word counts.</w:t>
       </w:r>
     </w:p>
     <w:p>
       <w:r>
-        <w:rPr>
-          <w:sz w:val="20"/>
-        </w:rPr>
         <w:t>- BO data: operation number, project details, BO validation date, author/service-office data, opinion authors, financing product name, and BO team fields.</w:t>
       </w:r>
     </w:p>
     <w:p>
       <w:r>
-        <w:rPr>
-          <w:sz w:val="20"/>
-        </w:rPr>
         <w:t>- Merged master table: single source for reporting, audit reconciliation, and Power BI refresh.</w:t>
       </w:r>
     </w:p>
     <w:p>
       <w:r>
-        <w:rPr>
-          <w:sz w:val="20"/>
-        </w:rPr>
         <w:t>- Auditing data: missing files, duplicate or unmatched operation numbers, visual-audit mismatches, and master-vs-source coverage gaps.</w:t>
       </w:r>
     </w:p>
@@ -650,33 +491,29 @@
     </w:p>
     <w:p>
       <w:r>
-        <w:rPr>
-          <w:sz w:val="20"/>
-        </w:rPr>
-        <w:t>- Recommended Power BI source: exported cleaned tables from Data Analysis/Exports, or the Master_Table_Q query if Power BI can connect directly to the workbook in a stable location.</w:t>
-      </w:r>
-    </w:p>
-    <w:p>
-      <w:r>
-        <w:rPr>
-          <w:sz w:val="20"/>
-        </w:rPr>
+        <w:t xml:space="preserve">- Recommended Power BI source: exported cleaned tables from Data Analysis/Exports, or the </w:t>
+      </w:r>
+      <w:proofErr w:type="spellStart"/>
+      <w:r>
+        <w:t>Master_Table_Q</w:t>
+      </w:r>
+      <w:proofErr w:type="spellEnd"/>
+      <w:r>
+        <w:t xml:space="preserve"> query if Power BI can connect directly to the workbook in a stable location.</w:t>
+      </w:r>
+    </w:p>
+    <w:p>
+      <w:r>
         <w:t>- Recommended report pages: Overview, Template Trends, Service Opinions, BO/Product View, Data Quality, Audit Coverage, and Record Explorer.</w:t>
       </w:r>
     </w:p>
     <w:p>
       <w:r>
-        <w:rPr>
-          <w:sz w:val="20"/>
-        </w:rPr>
         <w:t>- Recommended slicers: month, template, extraction type, batch/source folder, financing product, BO team, GED/match status, author/service-office, and service column.</w:t>
       </w:r>
     </w:p>
     <w:p>
       <w:r>
-        <w:rPr>
-          <w:sz w:val="20"/>
-        </w:rPr>
         <w:t>- Use the Python dashboard code as a reference for measures and views, not as the final production reporting tool.</w:t>
       </w:r>
     </w:p>
@@ -704,6 +541,7 @@
         <w:rPr>
           <w:b/>
         </w:rPr>
+        <w:lastRenderedPageBreak/>
         <w:t>2. Run extractors</w:t>
       </w:r>
       <w:r>
@@ -715,7 +553,19 @@
         <w:rPr>
           <w:b/>
         </w:rPr>
-        <w:t>3. Refresh audits</w:t>
+        <w:t xml:space="preserve">3. Refresh </w:t>
+      </w:r>
+      <w:r>
+        <w:rPr>
+          <w:b/>
+        </w:rPr>
+        <w:t xml:space="preserve">data </w:t>
+      </w:r>
+      <w:r>
+        <w:rPr>
+          <w:b/>
+        </w:rPr>
+        <w:t>audits</w:t>
       </w:r>
       <w:r>
         <w:t>: Run visible-PDF and database comparison checks for GNG, AFS, and OTHER. Review mismatches, missing files, duplicates, and manual correction candidates.</w:t>
@@ -729,7 +579,15 @@
         <w:t>4. Update master data</w:t>
       </w:r>
       <w:r>
-        <w:t>: Refresh Power Query/Master_Table_Q, BO data, GED list, and exported analysis tables. Reconcile operation-number joins and date fields.</w:t>
+        <w:t>: Refresh Power Query/</w:t>
+      </w:r>
+      <w:proofErr w:type="spellStart"/>
+      <w:r>
+        <w:t>Master_Table_Q</w:t>
+      </w:r>
+      <w:proofErr w:type="spellEnd"/>
+      <w:r>
+        <w:t>, BO data, GED list, and exported analysis tables. Reconcile operation-number joins and date fields.</w:t>
       </w:r>
     </w:p>
     <w:p>
@@ -764,49 +622,45 @@
     </w:p>
     <w:p>
       <w:r>
-        <w:rPr>
-          <w:sz w:val="20"/>
-        </w:rPr>
-        <w:t>- Coverage control: compare expected source files against files analyzed and records in the master table.</w:t>
-      </w:r>
-    </w:p>
-    <w:p>
-      <w:r>
-        <w:rPr>
-          <w:sz w:val="20"/>
-        </w:rPr>
+        <w:t xml:space="preserve">- Coverage control: compare expected source files against files </w:t>
+      </w:r>
+      <w:proofErr w:type="spellStart"/>
+      <w:r>
+        <w:t>analyzed</w:t>
+      </w:r>
+      <w:proofErr w:type="spellEnd"/>
+      <w:r>
+        <w:t xml:space="preserve"> and records in the master table.</w:t>
+      </w:r>
+    </w:p>
+    <w:p>
+      <w:r>
         <w:t>- Operation-number control: check missing, duplicate, or conflicting operation numbers before merging with BO data.</w:t>
       </w:r>
     </w:p>
     <w:p>
       <w:r>
-        <w:rPr>
-          <w:sz w:val="20"/>
-        </w:rPr>
         <w:t>- Date control: flag missing validation dates, future dates, and BO-vs-MC validation-date deltas.</w:t>
       </w:r>
     </w:p>
     <w:p>
       <w:r>
-        <w:rPr>
-          <w:sz w:val="20"/>
-        </w:rPr>
         <w:t>- Template control: verify that template-specific fields behave as expected, including no positive GNG words in non-GNG department columns such as SG.</w:t>
       </w:r>
     </w:p>
     <w:p>
       <w:r>
-        <w:rPr>
-          <w:sz w:val="20"/>
-        </w:rPr>
-        <w:t>- Audit control: retain visible-audit samples and field-level comparison summaries for monthly QA evidence.</w:t>
-      </w:r>
-    </w:p>
-    <w:p>
-      <w:r>
-        <w:rPr>
-          <w:sz w:val="20"/>
-        </w:rPr>
+        <w:t xml:space="preserve">- </w:t>
+      </w:r>
+      <w:r>
+        <w:t xml:space="preserve">Data </w:t>
+      </w:r>
+      <w:r>
+        <w:t>Audit control: retain visible-audit samples and field-level comparison summaries for monthly QA evidence.</w:t>
+      </w:r>
+    </w:p>
+    <w:p>
+      <w:r>
         <w:t>- Change control: update package changelogs when parser logic, mappings, workbook logic, or reporting definitions change.</w:t>
       </w:r>
     </w:p>
@@ -815,46 +669,47 @@
         <w:pStyle w:val="Heading1"/>
       </w:pPr>
       <w:r>
-        <w:t>9. Known Issues And Open Items</w:t>
-      </w:r>
-    </w:p>
-    <w:p>
-      <w:r>
-        <w:rPr>
-          <w:sz w:val="20"/>
-        </w:rPr>
-        <w:t>- The rough notes identify a mismatch between analyzed files and overall files. This should become a formal monthly coverage reconciliation.</w:t>
-      </w:r>
-    </w:p>
-    <w:p>
-      <w:r>
-        <w:rPr>
-          <w:sz w:val="20"/>
-        </w:rPr>
+        <w:t xml:space="preserve">9. Known Issues </w:t>
+      </w:r>
+      <w:proofErr w:type="gramStart"/>
+      <w:r>
+        <w:t>And</w:t>
+      </w:r>
+      <w:proofErr w:type="gramEnd"/>
+      <w:r>
+        <w:t xml:space="preserve"> Open Items</w:t>
+      </w:r>
+    </w:p>
+    <w:p>
+      <w:r>
+        <w:t xml:space="preserve">- The rough notes identify a mismatch between </w:t>
+      </w:r>
+      <w:proofErr w:type="spellStart"/>
+      <w:r>
+        <w:t>analyzed</w:t>
+      </w:r>
+      <w:proofErr w:type="spellEnd"/>
+      <w:r>
+        <w:t xml:space="preserve"> files and overall files. This should become a formal monthly coverage reconciliation.</w:t>
+      </w:r>
+    </w:p>
+    <w:p>
+      <w:r>
         <w:t>- OTHER notes need a more explicit rule for expected-file coverage because OTHER is broader and less template-uniform than GNG and AFS.</w:t>
       </w:r>
     </w:p>
     <w:p>
       <w:r>
-        <w:rPr>
-          <w:sz w:val="20"/>
-        </w:rPr>
         <w:t>- GNG author coverage is weak in the current data, so author/service-office analysis is stronger for AFS and OTHER than for GNG.</w:t>
       </w:r>
     </w:p>
     <w:p>
       <w:r>
-        <w:rPr>
-          <w:sz w:val="20"/>
-        </w:rPr>
         <w:t>- Text Before Opinions can differ slightly between parser output and visible-PDF extraction due to tokenization, so tolerance-based checks may be more useful than exact-match checks for that field.</w:t>
       </w:r>
     </w:p>
     <w:p>
       <w:r>
-        <w:rPr>
-          <w:sz w:val="20"/>
-        </w:rPr>
         <w:t>- Power BI should define stable measures for manual rate, document volume, median words, page counts, service opinion count, BO product mix, and audit exception counts.</w:t>
       </w:r>
     </w:p>
@@ -868,41 +723,35 @@
     </w:p>
     <w:p>
       <w:r>
-        <w:rPr>
-          <w:sz w:val="20"/>
-        </w:rPr>
         <w:t>- Power BI model specification: tables, relationships, measures, slicers, and report-page map.</w:t>
       </w:r>
     </w:p>
     <w:p>
       <w:r>
-        <w:rPr>
-          <w:sz w:val="20"/>
-        </w:rPr>
         <w:t>- Monthly refresh checklist: exact commands, expected outputs, owner, and sign-off criteria.</w:t>
       </w:r>
     </w:p>
     <w:p>
       <w:r>
-        <w:rPr>
-          <w:sz w:val="20"/>
-        </w:rPr>
-        <w:t>- Audit reconciliation sheet: expected files, analyzed files, master records, duplicates, missing joins, and manual-correction candidates.</w:t>
-      </w:r>
-    </w:p>
-    <w:p>
-      <w:r>
-        <w:rPr>
-          <w:sz w:val="20"/>
-        </w:rPr>
+        <w:t xml:space="preserve">- Audit reconciliation sheet: expected files, </w:t>
+      </w:r>
+      <w:proofErr w:type="spellStart"/>
+      <w:r>
+        <w:t>analyzed</w:t>
+      </w:r>
+      <w:proofErr w:type="spellEnd"/>
+      <w:r>
+        <w:t xml:space="preserve"> files, master records, duplicates, missing joins, and manual-correction candidates.</w:t>
+      </w:r>
+    </w:p>
+    <w:p>
+      <w:r>
         <w:t>- Power Query documentation: what each query does and which fields are authoritative.</w:t>
       </w:r>
     </w:p>
     <w:p>
       <w:r>
-        <w:rPr>
-          <w:sz w:val="20"/>
-        </w:rPr>
+        <w:lastRenderedPageBreak/>
         <w:t>- Short monthly summary page: volumes, manual rate, major audit exceptions, and any changes to extraction logic.</w:t>
       </w:r>
     </w:p>
@@ -1039,7 +888,6 @@
                               <w:rFonts w:ascii="Aptos" w:eastAsia="Aptos" w:hAnsi="Aptos" w:cs="Aptos"/>
                               <w:noProof/>
                               <w:color w:val="808080"/>
-                              <w:sz w:val="20"/>
                               <w:szCs w:val="20"/>
                             </w:rPr>
                           </w:pPr>
@@ -1048,7 +896,6 @@
                               <w:rFonts w:ascii="Aptos" w:eastAsia="Aptos" w:hAnsi="Aptos" w:cs="Aptos"/>
                               <w:noProof/>
                               <w:color w:val="808080"/>
-                              <w:sz w:val="20"/>
                               <w:szCs w:val="20"/>
                             </w:rPr>
                             <w:t>Corporate Use</w:t>
@@ -1084,7 +931,6 @@
                         <w:rFonts w:ascii="Aptos" w:eastAsia="Aptos" w:hAnsi="Aptos" w:cs="Aptos"/>
                         <w:noProof/>
                         <w:color w:val="808080"/>
-                        <w:sz w:val="20"/>
                         <w:szCs w:val="20"/>
                       </w:rPr>
                     </w:pPr>
@@ -1093,7 +939,6 @@
                         <w:rFonts w:ascii="Aptos" w:eastAsia="Aptos" w:hAnsi="Aptos" w:cs="Aptos"/>
                         <w:noProof/>
                         <w:color w:val="808080"/>
-                        <w:sz w:val="20"/>
                         <w:szCs w:val="20"/>
                       </w:rPr>
                       <w:t>Corporate Use</w:t>
@@ -1169,7 +1014,6 @@
                               <w:rFonts w:ascii="Aptos" w:eastAsia="Aptos" w:hAnsi="Aptos" w:cs="Aptos"/>
                               <w:noProof/>
                               <w:color w:val="808080"/>
-                              <w:sz w:val="20"/>
                               <w:szCs w:val="20"/>
                             </w:rPr>
                           </w:pPr>
@@ -1178,7 +1022,6 @@
                               <w:rFonts w:ascii="Aptos" w:eastAsia="Aptos" w:hAnsi="Aptos" w:cs="Aptos"/>
                               <w:noProof/>
                               <w:color w:val="808080"/>
-                              <w:sz w:val="20"/>
                               <w:szCs w:val="20"/>
                             </w:rPr>
                             <w:t>Corporate Use</w:t>
@@ -1214,7 +1057,6 @@
                         <w:rFonts w:ascii="Aptos" w:eastAsia="Aptos" w:hAnsi="Aptos" w:cs="Aptos"/>
                         <w:noProof/>
                         <w:color w:val="808080"/>
-                        <w:sz w:val="20"/>
                         <w:szCs w:val="20"/>
                       </w:rPr>
                     </w:pPr>
@@ -1223,7 +1065,6 @@
                         <w:rFonts w:ascii="Aptos" w:eastAsia="Aptos" w:hAnsi="Aptos" w:cs="Aptos"/>
                         <w:noProof/>
                         <w:color w:val="808080"/>
-                        <w:sz w:val="20"/>
                         <w:szCs w:val="20"/>
                       </w:rPr>
                       <w:t>Corporate Use</w:t>
@@ -1299,7 +1140,6 @@
                               <w:rFonts w:ascii="Aptos" w:eastAsia="Aptos" w:hAnsi="Aptos" w:cs="Aptos"/>
                               <w:noProof/>
                               <w:color w:val="808080"/>
-                              <w:sz w:val="20"/>
                               <w:szCs w:val="20"/>
                             </w:rPr>
                           </w:pPr>
@@ -1308,7 +1148,6 @@
                               <w:rFonts w:ascii="Aptos" w:eastAsia="Aptos" w:hAnsi="Aptos" w:cs="Aptos"/>
                               <w:noProof/>
                               <w:color w:val="808080"/>
-                              <w:sz w:val="20"/>
                               <w:szCs w:val="20"/>
                             </w:rPr>
                             <w:t>Corporate Use</w:t>
@@ -1344,7 +1183,6 @@
                         <w:rFonts w:ascii="Aptos" w:eastAsia="Aptos" w:hAnsi="Aptos" w:cs="Aptos"/>
                         <w:noProof/>
                         <w:color w:val="808080"/>
-                        <w:sz w:val="20"/>
                         <w:szCs w:val="20"/>
                       </w:rPr>
                     </w:pPr>
@@ -1353,7 +1191,6 @@
                         <w:rFonts w:ascii="Aptos" w:eastAsia="Aptos" w:hAnsi="Aptos" w:cs="Aptos"/>
                         <w:noProof/>
                         <w:color w:val="808080"/>
-                        <w:sz w:val="20"/>
                         <w:szCs w:val="20"/>
                       </w:rPr>
                       <w:t>Corporate Use</w:t>
@@ -2260,7 +2097,7 @@
       <w:outlineLvl w:val="0"/>
     </w:pPr>
     <w:rPr>
-      <w:rFonts w:asciiTheme="majorHAnsi" w:eastAsiaTheme="majorEastAsia" w:hAnsiTheme="majorHAnsi" w:cstheme="majorBidi" w:ascii="Calibri" w:hAnsi="Calibri"/>
+      <w:rFonts w:asciiTheme="majorHAnsi" w:eastAsiaTheme="majorEastAsia" w:hAnsiTheme="majorHAnsi" w:cstheme="majorBidi"/>
       <w:color w:val="0F4761" w:themeColor="accent1" w:themeShade="BF"/>
       <w:sz w:val="36"/>
       <w:szCs w:val="40"/>
@@ -2283,7 +2120,7 @@
       <w:outlineLvl w:val="1"/>
     </w:pPr>
     <w:rPr>
-      <w:rFonts w:asciiTheme="majorHAnsi" w:eastAsiaTheme="majorEastAsia" w:hAnsiTheme="majorHAnsi" w:cstheme="majorBidi" w:ascii="Calibri" w:hAnsi="Calibri"/>
+      <w:rFonts w:asciiTheme="majorHAnsi" w:eastAsiaTheme="majorEastAsia" w:hAnsiTheme="majorHAnsi" w:cstheme="majorBidi"/>
       <w:color w:val="0F4761" w:themeColor="accent1" w:themeShade="BF"/>
       <w:sz w:val="26"/>
       <w:szCs w:val="32"/>
@@ -2306,7 +2143,7 @@
       <w:outlineLvl w:val="2"/>
     </w:pPr>
     <w:rPr>
-      <w:rFonts w:eastAsiaTheme="majorEastAsia" w:cstheme="majorBidi" w:ascii="Calibri" w:hAnsi="Calibri"/>
+      <w:rFonts w:eastAsiaTheme="majorEastAsia" w:cstheme="majorBidi"/>
       <w:color w:val="0F4761" w:themeColor="accent1" w:themeShade="BF"/>
       <w:sz w:val="22"/>
       <w:szCs w:val="28"/>

</xml_diff>